<commit_message>
Updated report with proper indentation
</commit_message>
<xml_diff>
--- a/docs/Ravi Teja Kothuru_SLAM ASR_Report.docx
+++ b/docs/Ravi Teja Kothuru_SLAM ASR_Report.docx
@@ -569,6 +569,18 @@
     </w:p>
     <w:p>
       <w:pPr>
+        <w:rPr>
+          <w:b/>
+          <w:bCs/>
+          <w:color w:val="000000"/>
+        </w:rPr>
+      </w:pPr>
+      <w:r>
+        <w:br w:type="page"/>
+      </w:r>
+    </w:p>
+    <w:p>
+      <w:pPr>
         <w:pStyle w:val="Heading2"/>
         <w:spacing w:line="360" w:lineRule="auto"/>
         <w:jc w:val="center"/>
@@ -582,6 +594,7 @@
           <w:sz w:val="24"/>
           <w:szCs w:val="24"/>
         </w:rPr>
+        <w:lastRenderedPageBreak/>
         <w:t>Introduction</w:t>
       </w:r>
     </w:p>
@@ -591,7 +604,6 @@
         <w:ind w:firstLine="720"/>
       </w:pPr>
       <w:r>
-        <w:lastRenderedPageBreak/>
         <w:t>Indian technical-education content routinely mixes Hindi and English within a single sentence. In a computer-science lecture on Linux, a typical utterance is</w:t>
       </w:r>
     </w:p>
@@ -960,7 +972,11 @@
         <w:t>-</w:t>
       </w:r>
       <w:r>
-        <w:t xml:space="preserve"> motivated our architecture choice. Our implementation differs by (a) using Whisper's encoder rather than </w:t>
+        <w:t xml:space="preserve"> motivated our architecture </w:t>
+      </w:r>
+      <w:r>
+        <w:lastRenderedPageBreak/>
+        <w:t xml:space="preserve">choice. Our implementation differs by (a) using Whisper's encoder rather than </w:t>
       </w:r>
       <w:proofErr w:type="spellStart"/>
       <w:r>
@@ -968,11 +984,7 @@
       </w:r>
       <w:proofErr w:type="spellEnd"/>
       <w:r>
-        <w:t xml:space="preserve">, and </w:t>
-      </w:r>
-      <w:r>
-        <w:lastRenderedPageBreak/>
-        <w:t xml:space="preserve">(b) </w:t>
+        <w:t xml:space="preserve">, and (b) </w:t>
       </w:r>
       <w:proofErr w:type="spellStart"/>
       <w:r>
@@ -1053,6 +1065,7 @@
       <w:pPr>
         <w:pStyle w:val="Heading2"/>
         <w:spacing w:line="360" w:lineRule="auto"/>
+        <w:jc w:val="center"/>
         <w:rPr>
           <w:sz w:val="24"/>
           <w:szCs w:val="24"/>
@@ -1063,7 +1076,7 @@
           <w:sz w:val="24"/>
           <w:szCs w:val="24"/>
         </w:rPr>
-        <w:t>3. Course context and trait taxonomy (Days 1-2)</w:t>
+        <w:t>Course context and trait taxonomy</w:t>
       </w:r>
     </w:p>
     <w:p>
@@ -1300,24 +1313,21 @@
     </w:p>
     <w:p>
       <w:pPr>
-        <w:pBdr>
-          <w:bottom w:val="single" w:sz="6" w:space="1" w:color="auto"/>
-        </w:pBdr>
-        <w:spacing w:line="360" w:lineRule="auto"/>
-      </w:pPr>
-    </w:p>
-    <w:p>
-      <w:pPr>
-        <w:spacing w:line="360" w:lineRule="auto"/>
-      </w:pPr>
-      <w:r>
-        <w:t xml:space="preserve"> </w:t>
+        <w:rPr>
+          <w:b/>
+          <w:bCs/>
+          <w:color w:val="000000"/>
+        </w:rPr>
+      </w:pPr>
+      <w:r>
+        <w:br w:type="page"/>
       </w:r>
     </w:p>
     <w:p>
       <w:pPr>
         <w:pStyle w:val="Heading2"/>
         <w:spacing w:line="360" w:lineRule="auto"/>
+        <w:jc w:val="center"/>
         <w:rPr>
           <w:sz w:val="24"/>
           <w:szCs w:val="24"/>
@@ -1328,80 +1338,16 @@
           <w:sz w:val="24"/>
           <w:szCs w:val="24"/>
         </w:rPr>
-        <w:t>4. Dataset</w:t>
-      </w:r>
-    </w:p>
-    <w:p>
-      <w:pPr>
-        <w:spacing w:line="360" w:lineRule="auto"/>
-      </w:pPr>
-      <w:r>
-        <w:t>MUCS 2021 Subtask-2 (Hindi-English) is released with three splits.</w:t>
-      </w:r>
-    </w:p>
-    <w:p>
-      <w:pPr>
-        <w:spacing w:line="360" w:lineRule="auto"/>
-      </w:pPr>
-      <w:r>
         <w:lastRenderedPageBreak/>
-        <w:t xml:space="preserve"> </w:t>
-      </w:r>
-    </w:p>
-    <w:p>
-      <w:pPr>
-        <w:spacing w:line="360" w:lineRule="auto"/>
-      </w:pPr>
-      <w:r>
-        <w:rPr>
-          <w:b/>
-          <w:bCs/>
-        </w:rPr>
-        <w:t xml:space="preserve">Table 1 </w:t>
-      </w:r>
-      <w:r>
-        <w:rPr>
-          <w:b/>
-          <w:bCs/>
-        </w:rPr>
-        <w:t>-</w:t>
-      </w:r>
-      <w:r>
-        <w:rPr>
-          <w:b/>
-          <w:bCs/>
-        </w:rPr>
-        <w:t xml:space="preserve"> MUCS 2021 Subtask-2 statistics</w:t>
-      </w:r>
-      <w:r>
-        <w:t xml:space="preserve"> (from our analysis, </w:t>
-      </w:r>
-      <w:proofErr w:type="spellStart"/>
-      <w:r>
-        <w:rPr>
-          <w:rFonts w:eastAsia="Courier New"/>
-          <w:shd w:val="clear" w:color="auto" w:fill="F1F5F9"/>
-        </w:rPr>
-        <w:t>manifest_statistics</w:t>
-      </w:r>
-      <w:proofErr w:type="spellEnd"/>
-      <w:r>
-        <w:rPr>
-          <w:rFonts w:eastAsia="Courier New"/>
-          <w:shd w:val="clear" w:color="auto" w:fill="F1F5F9"/>
-        </w:rPr>
-        <w:t>(...)</w:t>
-      </w:r>
-      <w:r>
-        <w:t xml:space="preserve"> on each split)</w:t>
-      </w:r>
-    </w:p>
-    <w:p>
-      <w:pPr>
-        <w:spacing w:line="360" w:lineRule="auto"/>
-      </w:pPr>
-      <w:r>
-        <w:t xml:space="preserve"> </w:t>
+        <w:t>Dataset</w:t>
+      </w:r>
+    </w:p>
+    <w:p>
+      <w:pPr>
+        <w:spacing w:line="360" w:lineRule="auto"/>
+      </w:pPr>
+      <w:r>
+        <w:t xml:space="preserve">MUCS 2021 Subtask-2 (Hindi-English) is released with three splits. </w:t>
       </w:r>
     </w:p>
     <w:tbl>
@@ -1850,45 +1796,280 @@
     </w:tbl>
     <w:p>
       <w:pPr>
-        <w:spacing w:before="240" w:line="360" w:lineRule="auto"/>
-      </w:pPr>
-      <w:r>
+        <w:spacing w:line="360" w:lineRule="auto"/>
+        <w:jc w:val="center"/>
+      </w:pPr>
+      <w:r>
+        <w:rPr>
+          <w:b/>
+          <w:bCs/>
+        </w:rPr>
+        <w:t xml:space="preserve">Table 1 </w:t>
+      </w:r>
+      <w:r>
+        <w:rPr>
+          <w:b/>
+          <w:bCs/>
+        </w:rPr>
+        <w:t>-</w:t>
+      </w:r>
+      <w:r>
+        <w:rPr>
+          <w:b/>
+          <w:bCs/>
+        </w:rPr>
+        <w:t xml:space="preserve"> MUCS 2021 Subtask-2 statistics</w:t>
+      </w:r>
+      <w:r>
+        <w:t xml:space="preserve"> (from our analysis, </w:t>
+      </w:r>
+      <w:proofErr w:type="spellStart"/>
+      <w:r>
+        <w:rPr>
+          <w:rFonts w:eastAsia="Courier New"/>
+          <w:shd w:val="clear" w:color="auto" w:fill="F1F5F9"/>
+        </w:rPr>
+        <w:t>manifest_statistics</w:t>
+      </w:r>
+      <w:proofErr w:type="spellEnd"/>
+      <w:r>
+        <w:rPr>
+          <w:rFonts w:eastAsia="Courier New"/>
+          <w:shd w:val="clear" w:color="auto" w:fill="F1F5F9"/>
+        </w:rPr>
+        <w:t>(...)</w:t>
+      </w:r>
+      <w:r>
+        <w:t xml:space="preserve"> on each split)</w:t>
+      </w:r>
+    </w:p>
+    <w:p>
+      <w:pPr>
+        <w:spacing w:line="360" w:lineRule="auto"/>
+      </w:pPr>
+      <w:r>
+        <w:rPr>
+          <w:b/>
+          <w:bCs/>
+        </w:rPr>
+        <w:t>Preprocessing pipeline.</w:t>
+      </w:r>
+      <w:r>
+        <w:t xml:space="preserve"> All splits are </w:t>
+      </w:r>
+      <w:proofErr w:type="spellStart"/>
+      <w:r>
+        <w:t>canonicalised</w:t>
+      </w:r>
+      <w:proofErr w:type="spellEnd"/>
+      <w:r>
+        <w:t xml:space="preserve"> via </w:t>
+      </w:r>
+      <w:proofErr w:type="spellStart"/>
+      <w:r>
+        <w:rPr>
+          <w:rFonts w:eastAsia="Courier New"/>
+          <w:shd w:val="clear" w:color="auto" w:fill="F1F5F9"/>
+        </w:rPr>
+        <w:t>CodeSwitchTextNormalizer</w:t>
+      </w:r>
+      <w:proofErr w:type="spellEnd"/>
+      <w:r>
+        <w:t>:</w:t>
+      </w:r>
+    </w:p>
+    <w:p>
+      <w:pPr>
+        <w:pStyle w:val="ListParagraph"/>
+        <w:numPr>
+          <w:ilvl w:val="0"/>
+          <w:numId w:val="19"/>
+        </w:numPr>
+        <w:spacing w:line="360" w:lineRule="auto"/>
+      </w:pPr>
+      <w:r>
+        <w:t xml:space="preserve">Unicode NFC normalisation (so </w:t>
+      </w:r>
+      <w:r>
+        <w:rPr>
+          <w:rFonts w:ascii="Kohinoor Devanagari" w:eastAsia="Courier New" w:hAnsi="Kohinoor Devanagari" w:cs="Kohinoor Devanagari"/>
+          <w:shd w:val="clear" w:color="auto" w:fill="F1F5F9"/>
+        </w:rPr>
+        <w:t>क</w:t>
+      </w:r>
+      <w:r>
+        <w:rPr>
+          <w:rFonts w:eastAsia="Courier New"/>
+          <w:shd w:val="clear" w:color="auto" w:fill="F1F5F9"/>
+        </w:rPr>
+        <w:t xml:space="preserve"> + </w:t>
+      </w:r>
+      <w:r>
+        <w:rPr>
+          <w:rFonts w:ascii="Kohinoor Devanagari" w:eastAsia="Courier New" w:hAnsi="Kohinoor Devanagari" w:cs="Kohinoor Devanagari"/>
+          <w:shd w:val="clear" w:color="auto" w:fill="F1F5F9"/>
+        </w:rPr>
+        <w:t>ि</w:t>
+      </w:r>
+      <w:r>
+        <w:t xml:space="preserve"> matches </w:t>
+      </w:r>
+      <w:proofErr w:type="spellStart"/>
+      <w:r>
+        <w:rPr>
+          <w:rFonts w:ascii="Kohinoor Devanagari" w:eastAsia="Courier New" w:hAnsi="Kohinoor Devanagari" w:cs="Kohinoor Devanagari"/>
+          <w:shd w:val="clear" w:color="auto" w:fill="F1F5F9"/>
+        </w:rPr>
+        <w:t>कि</w:t>
+      </w:r>
+      <w:proofErr w:type="spellEnd"/>
+      <w:r>
+        <w:t>).</w:t>
+      </w:r>
+    </w:p>
+    <w:p>
+      <w:pPr>
+        <w:pStyle w:val="ListParagraph"/>
+        <w:numPr>
+          <w:ilvl w:val="0"/>
+          <w:numId w:val="19"/>
+        </w:numPr>
+        <w:spacing w:line="360" w:lineRule="auto"/>
+      </w:pPr>
+      <w:r>
+        <w:t>Lower-case ASCII / Latin (Devanagari has no case).</w:t>
+      </w:r>
+    </w:p>
+    <w:p>
+      <w:pPr>
+        <w:pStyle w:val="ListParagraph"/>
+        <w:numPr>
+          <w:ilvl w:val="0"/>
+          <w:numId w:val="19"/>
+        </w:numPr>
+        <w:spacing w:line="360" w:lineRule="auto"/>
+      </w:pPr>
+      <w:r>
+        <w:t xml:space="preserve">Devanagari digits </w:t>
+      </w:r>
+      <w:r>
+        <w:rPr>
+          <w:rFonts w:ascii="Kohinoor Devanagari" w:eastAsia="Courier New" w:hAnsi="Kohinoor Devanagari" w:cs="Kohinoor Devanagari"/>
+          <w:shd w:val="clear" w:color="auto" w:fill="F1F5F9"/>
+        </w:rPr>
+        <w:t>०</w:t>
+      </w:r>
+      <w:r>
+        <w:rPr>
+          <w:rFonts w:eastAsia="Courier New"/>
+          <w:shd w:val="clear" w:color="auto" w:fill="F1F5F9"/>
+        </w:rPr>
+        <w:t>–</w:t>
+      </w:r>
+      <w:r>
+        <w:rPr>
+          <w:rFonts w:ascii="Kohinoor Devanagari" w:eastAsia="Courier New" w:hAnsi="Kohinoor Devanagari" w:cs="Kohinoor Devanagari"/>
+          <w:shd w:val="clear" w:color="auto" w:fill="F1F5F9"/>
+        </w:rPr>
+        <w:t>९</w:t>
+      </w:r>
+      <w:r>
+        <w:t xml:space="preserve"> → Roman </w:t>
+      </w:r>
+      <w:r>
+        <w:rPr>
+          <w:rFonts w:eastAsia="Courier New"/>
+          <w:shd w:val="clear" w:color="auto" w:fill="F1F5F9"/>
+        </w:rPr>
+        <w:t>0–9</w:t>
+      </w:r>
+      <w:r>
+        <w:t>.</w:t>
+      </w:r>
+    </w:p>
+    <w:p>
+      <w:pPr>
+        <w:pStyle w:val="ListParagraph"/>
+        <w:numPr>
+          <w:ilvl w:val="0"/>
+          <w:numId w:val="19"/>
+        </w:numPr>
+        <w:spacing w:line="360" w:lineRule="auto"/>
+      </w:pPr>
+      <w:r>
+        <w:t>Punctuation stripped (</w:t>
+      </w:r>
+      <w:r>
+        <w:rPr>
+          <w:rFonts w:eastAsia="Courier New"/>
+          <w:shd w:val="clear" w:color="auto" w:fill="F1F5F9"/>
+        </w:rPr>
+        <w:t xml:space="preserve">. , ; : ' " ! ? ( ) [ ] { } - / \ | </w:t>
+      </w:r>
+      <w:r>
+        <w:t xml:space="preserve"> and </w:t>
+      </w:r>
+      <w:r>
+        <w:rPr>
+          <w:rFonts w:ascii="Kohinoor Devanagari" w:eastAsia="Courier New" w:hAnsi="Kohinoor Devanagari" w:cs="Kohinoor Devanagari"/>
+          <w:shd w:val="clear" w:color="auto" w:fill="F1F5F9"/>
+        </w:rPr>
+        <w:t>।</w:t>
+      </w:r>
+      <w:r>
+        <w:rPr>
+          <w:rFonts w:eastAsia="Courier New"/>
+          <w:shd w:val="clear" w:color="auto" w:fill="F1F5F9"/>
+        </w:rPr>
         <w:t xml:space="preserve"> </w:t>
       </w:r>
-    </w:p>
-    <w:p>
-      <w:pPr>
-        <w:spacing w:line="360" w:lineRule="auto"/>
-      </w:pPr>
-      <w:r>
-        <w:rPr>
-          <w:b/>
-          <w:bCs/>
-        </w:rPr>
-        <w:t>Preprocessing pipeline.</w:t>
-      </w:r>
-      <w:r>
-        <w:t xml:space="preserve"> All splits are </w:t>
-      </w:r>
-      <w:proofErr w:type="spellStart"/>
-      <w:r>
-        <w:t>canonicalised</w:t>
-      </w:r>
-      <w:proofErr w:type="spellEnd"/>
-      <w:r>
-        <w:t xml:space="preserve"> via </w:t>
-      </w:r>
-      <w:proofErr w:type="spellStart"/>
-      <w:r>
-        <w:rPr>
-          <w:rFonts w:eastAsia="Courier New"/>
-          <w:shd w:val="clear" w:color="auto" w:fill="F1F5F9"/>
-        </w:rPr>
-        <w:t>CodeSwitchTextNormalizer</w:t>
-      </w:r>
-      <w:proofErr w:type="spellEnd"/>
-      <w:r>
-        <w:t>:</w:t>
+      <w:r>
+        <w:rPr>
+          <w:rFonts w:ascii="Kohinoor Devanagari" w:eastAsia="Courier New" w:hAnsi="Kohinoor Devanagari" w:cs="Kohinoor Devanagari"/>
+          <w:shd w:val="clear" w:color="auto" w:fill="F1F5F9"/>
+        </w:rPr>
+        <w:t>॥</w:t>
+      </w:r>
+      <w:r>
+        <w:t>).</w:t>
+      </w:r>
+    </w:p>
+    <w:p>
+      <w:pPr>
+        <w:pStyle w:val="ListParagraph"/>
+        <w:numPr>
+          <w:ilvl w:val="0"/>
+          <w:numId w:val="19"/>
+        </w:numPr>
+        <w:spacing w:line="360" w:lineRule="auto"/>
+      </w:pPr>
+      <w:r>
+        <w:t>Whitespace collapsed.</w:t>
+      </w:r>
+    </w:p>
+    <w:p>
+      <w:pPr>
+        <w:spacing w:line="360" w:lineRule="auto"/>
+        <w:ind w:firstLine="720"/>
+      </w:pPr>
+    </w:p>
+    <w:p>
+      <w:pPr>
+        <w:spacing w:line="360" w:lineRule="auto"/>
+        <w:ind w:firstLine="720"/>
+      </w:pPr>
+      <w:r>
+        <w:t xml:space="preserve">The normaliser is </w:t>
+      </w:r>
+      <w:r>
+        <w:rPr>
+          <w:b/>
+          <w:bCs/>
+        </w:rPr>
+        <w:t>deterministic and idempotent</w:t>
+      </w:r>
+      <w:r>
+        <w:t>, guaranteeing reproducible WER across runs. The exact same normaliser is applied to both hypothesis and reference before scoring.</w:t>
       </w:r>
     </w:p>
     <w:p>
@@ -1902,95 +2083,224 @@
     <w:p>
       <w:pPr>
         <w:spacing w:line="360" w:lineRule="auto"/>
-        <w:ind w:left="20"/>
-      </w:pPr>
-      <w:r>
-        <w:t xml:space="preserve">1. Unicode NFC normalisation (so </w:t>
-      </w:r>
-      <w:r>
-        <w:rPr>
-          <w:rFonts w:ascii="Kohinoor Devanagari" w:eastAsia="Courier New" w:hAnsi="Kohinoor Devanagari" w:cs="Kohinoor Devanagari"/>
-          <w:shd w:val="clear" w:color="auto" w:fill="F1F5F9"/>
-        </w:rPr>
-        <w:t>क</w:t>
-      </w:r>
-      <w:r>
-        <w:rPr>
-          <w:rFonts w:eastAsia="Courier New"/>
-          <w:shd w:val="clear" w:color="auto" w:fill="F1F5F9"/>
-        </w:rPr>
-        <w:t xml:space="preserve"> + </w:t>
-      </w:r>
-      <w:r>
-        <w:rPr>
-          <w:rFonts w:ascii="Kohinoor Devanagari" w:eastAsia="Courier New" w:hAnsi="Kohinoor Devanagari" w:cs="Kohinoor Devanagari"/>
-          <w:shd w:val="clear" w:color="auto" w:fill="F1F5F9"/>
-        </w:rPr>
-        <w:t>ि</w:t>
-      </w:r>
-      <w:r>
-        <w:t xml:space="preserve"> matches </w:t>
-      </w:r>
-      <w:proofErr w:type="spellStart"/>
-      <w:r>
-        <w:rPr>
-          <w:rFonts w:ascii="Kohinoor Devanagari" w:eastAsia="Courier New" w:hAnsi="Kohinoor Devanagari" w:cs="Kohinoor Devanagari"/>
-          <w:shd w:val="clear" w:color="auto" w:fill="F1F5F9"/>
-        </w:rPr>
-        <w:t>कि</w:t>
-      </w:r>
-      <w:proofErr w:type="spellEnd"/>
-      <w:r>
-        <w:t>).</w:t>
-      </w:r>
-    </w:p>
-    <w:p>
-      <w:pPr>
-        <w:spacing w:line="360" w:lineRule="auto"/>
-        <w:ind w:left="20"/>
-      </w:pPr>
-      <w:r>
-        <w:t>2. Lower-case ASCII / Latin (Devanagari has no case).</w:t>
-      </w:r>
-    </w:p>
-    <w:p>
-      <w:pPr>
-        <w:spacing w:line="360" w:lineRule="auto"/>
-        <w:ind w:left="20"/>
-      </w:pPr>
-      <w:r>
-        <w:t xml:space="preserve">3. Devanagari digits </w:t>
-      </w:r>
-      <w:r>
-        <w:rPr>
-          <w:rFonts w:ascii="Kohinoor Devanagari" w:eastAsia="Courier New" w:hAnsi="Kohinoor Devanagari" w:cs="Kohinoor Devanagari"/>
-          <w:shd w:val="clear" w:color="auto" w:fill="F1F5F9"/>
-        </w:rPr>
-        <w:t>०</w:t>
-      </w:r>
-      <w:r>
-        <w:rPr>
-          <w:rFonts w:eastAsia="Courier New"/>
-          <w:shd w:val="clear" w:color="auto" w:fill="F1F5F9"/>
-        </w:rPr>
-        <w:t>–</w:t>
-      </w:r>
-      <w:r>
-        <w:rPr>
-          <w:rFonts w:ascii="Kohinoor Devanagari" w:eastAsia="Courier New" w:hAnsi="Kohinoor Devanagari" w:cs="Kohinoor Devanagari"/>
-          <w:shd w:val="clear" w:color="auto" w:fill="F1F5F9"/>
-        </w:rPr>
-        <w:t>९</w:t>
-      </w:r>
-      <w:r>
-        <w:t xml:space="preserve"> → Roman </w:t>
-      </w:r>
-      <w:r>
-        <w:rPr>
-          <w:rFonts w:eastAsia="Courier New"/>
-          <w:shd w:val="clear" w:color="auto" w:fill="F1F5F9"/>
-        </w:rPr>
-        <w:t>0–9</w:t>
+      </w:pPr>
+      <w:r>
+        <w:rPr>
+          <w:b/>
+          <w:bCs/>
+        </w:rPr>
+        <w:t>Path rewriting.</w:t>
+      </w:r>
+      <w:r>
+        <w:t xml:space="preserve"> The upstream manifests ship with absolute paths pointing at the dataset author's server. </w:t>
+      </w:r>
+      <w:proofErr w:type="spellStart"/>
+      <w:r>
+        <w:rPr>
+          <w:rFonts w:eastAsia="Courier New"/>
+          <w:shd w:val="clear" w:color="auto" w:fill="F1F5F9"/>
+        </w:rPr>
+        <w:t>rewrite_manifest_paths</w:t>
+      </w:r>
+      <w:proofErr w:type="spellEnd"/>
+      <w:r>
+        <w:rPr>
+          <w:rFonts w:eastAsia="Courier New"/>
+          <w:shd w:val="clear" w:color="auto" w:fill="F1F5F9"/>
+        </w:rPr>
+        <w:t>(...)</w:t>
+      </w:r>
+      <w:r>
+        <w:t xml:space="preserve"> rebases them to the Kaggle mount and inserts the missing 3-digit speaker sub-directory (</w:t>
+      </w:r>
+      <w:r>
+        <w:rPr>
+          <w:rFonts w:eastAsia="Courier New"/>
+          <w:shd w:val="clear" w:color="auto" w:fill="F1F5F9"/>
+        </w:rPr>
+        <w:t>&lt;split&gt;/&lt;spk3&gt;/&lt;file&gt;.wav</w:t>
+      </w:r>
+      <w:r>
+        <w:t>) which the physical layout requires.</w:t>
+      </w:r>
+    </w:p>
+    <w:p>
+      <w:pPr>
+        <w:rPr>
+          <w:b/>
+          <w:bCs/>
+        </w:rPr>
+      </w:pPr>
+      <w:r>
+        <w:rPr>
+          <w:b/>
+          <w:bCs/>
+        </w:rPr>
+        <w:br w:type="page"/>
+      </w:r>
+    </w:p>
+    <w:p>
+      <w:pPr>
+        <w:spacing w:line="360" w:lineRule="auto"/>
+        <w:jc w:val="center"/>
+        <w:rPr>
+          <w:b/>
+          <w:bCs/>
+        </w:rPr>
+      </w:pPr>
+      <w:r>
+        <w:rPr>
+          <w:b/>
+          <w:bCs/>
+        </w:rPr>
+        <w:lastRenderedPageBreak/>
+        <w:t xml:space="preserve">Classical baseline </w:t>
+      </w:r>
+      <w:r>
+        <w:rPr>
+          <w:b/>
+          <w:bCs/>
+        </w:rPr>
+        <w:t>-</w:t>
+      </w:r>
+      <w:r>
+        <w:rPr>
+          <w:b/>
+          <w:bCs/>
+        </w:rPr>
+        <w:t xml:space="preserve"> GMM keyword spotter</w:t>
+      </w:r>
+    </w:p>
+    <w:p>
+      <w:pPr>
+        <w:spacing w:line="360" w:lineRule="auto"/>
+      </w:pPr>
+      <w:r>
+        <w:t>I</w:t>
+      </w:r>
+      <w:r>
+        <w:t xml:space="preserve"> buil</w:t>
+      </w:r>
+      <w:r>
+        <w:t>t</w:t>
+      </w:r>
+      <w:r>
+        <w:t xml:space="preserve"> the classical pre-deep-learning baseline as a per-class Gaussian Mixture Model classifier over MFCC frames.</w:t>
+      </w:r>
+    </w:p>
+    <w:p>
+      <w:pPr>
+        <w:spacing w:line="360" w:lineRule="auto"/>
+      </w:pPr>
+      <w:r>
+        <w:rPr>
+          <w:b/>
+          <w:bCs/>
+        </w:rPr>
+        <w:t>Features.</w:t>
+      </w:r>
+      <w:r>
+        <w:t xml:space="preserve"> 13 MFCCs + Δ + Δ² = 39-dim, 25 </w:t>
+      </w:r>
+      <w:proofErr w:type="spellStart"/>
+      <w:r>
+        <w:t>ms</w:t>
+      </w:r>
+      <w:proofErr w:type="spellEnd"/>
+      <w:r>
+        <w:t xml:space="preserve"> window / 10 </w:t>
+      </w:r>
+      <w:proofErr w:type="spellStart"/>
+      <w:r>
+        <w:t>ms</w:t>
+      </w:r>
+      <w:proofErr w:type="spellEnd"/>
+      <w:r>
+        <w:t xml:space="preserve"> hop.</w:t>
+      </w:r>
+    </w:p>
+    <w:p>
+      <w:pPr>
+        <w:spacing w:line="360" w:lineRule="auto"/>
+      </w:pPr>
+      <w:r>
+        <w:rPr>
+          <w:b/>
+          <w:bCs/>
+        </w:rPr>
+        <w:t>Classes.</w:t>
+      </w:r>
+      <w:r>
+        <w:t xml:space="preserve"> Five English technical keywords (</w:t>
+      </w:r>
+      <w:r>
+        <w:rPr>
+          <w:rFonts w:eastAsia="Courier New"/>
+          <w:shd w:val="clear" w:color="auto" w:fill="F1F5F9"/>
+        </w:rPr>
+        <w:t>tutorial</w:t>
+      </w:r>
+      <w:r>
+        <w:t xml:space="preserve">, </w:t>
+      </w:r>
+      <w:proofErr w:type="spellStart"/>
+      <w:r>
+        <w:rPr>
+          <w:rFonts w:eastAsia="Courier New"/>
+          <w:shd w:val="clear" w:color="auto" w:fill="F1F5F9"/>
+        </w:rPr>
+        <w:t>linux</w:t>
+      </w:r>
+      <w:proofErr w:type="spellEnd"/>
+      <w:r>
+        <w:t xml:space="preserve">, </w:t>
+      </w:r>
+      <w:r>
+        <w:rPr>
+          <w:rFonts w:eastAsia="Courier New"/>
+          <w:shd w:val="clear" w:color="auto" w:fill="F1F5F9"/>
+        </w:rPr>
+        <w:t>python</w:t>
+      </w:r>
+      <w:r>
+        <w:t xml:space="preserve">, </w:t>
+      </w:r>
+      <w:r>
+        <w:rPr>
+          <w:rFonts w:eastAsia="Courier New"/>
+          <w:shd w:val="clear" w:color="auto" w:fill="F1F5F9"/>
+        </w:rPr>
+        <w:t>file</w:t>
+      </w:r>
+      <w:r>
+        <w:t xml:space="preserve">, </w:t>
+      </w:r>
+      <w:r>
+        <w:rPr>
+          <w:rFonts w:eastAsia="Courier New"/>
+          <w:shd w:val="clear" w:color="auto" w:fill="F1F5F9"/>
+        </w:rPr>
+        <w:t>window</w:t>
+      </w:r>
+      <w:r>
+        <w:t xml:space="preserve">) plus a </w:t>
+      </w:r>
+      <w:r>
+        <w:rPr>
+          <w:rFonts w:eastAsia="Courier New"/>
+          <w:shd w:val="clear" w:color="auto" w:fill="F1F5F9"/>
+        </w:rPr>
+        <w:t>&lt;background&gt;</w:t>
+      </w:r>
+      <w:r>
+        <w:t xml:space="preserve"> class of utterances containing none of them. Up to 80 utterances per class in </w:t>
+      </w:r>
+      <w:r>
+        <w:rPr>
+          <w:rFonts w:eastAsia="Courier New"/>
+          <w:shd w:val="clear" w:color="auto" w:fill="F1F5F9"/>
+        </w:rPr>
+        <w:t>QUICK_MODE</w:t>
       </w:r>
       <w:r>
         <w:t>.</w:t>
@@ -1999,266 +2309,61 @@
     <w:p>
       <w:pPr>
         <w:spacing w:line="360" w:lineRule="auto"/>
-        <w:ind w:left="20"/>
-      </w:pPr>
-      <w:r>
-        <w:t>4. Punctuation stripped (</w:t>
-      </w:r>
-      <w:r>
-        <w:rPr>
-          <w:rFonts w:eastAsia="Courier New"/>
-          <w:shd w:val="clear" w:color="auto" w:fill="F1F5F9"/>
-        </w:rPr>
-        <w:t xml:space="preserve">. , ; : ' " ! ? ( ) [ ] { } - / \ | </w:t>
-      </w:r>
-      <w:r>
-        <w:t xml:space="preserve"> and </w:t>
-      </w:r>
-      <w:r>
-        <w:rPr>
-          <w:rFonts w:ascii="Kohinoor Devanagari" w:eastAsia="Courier New" w:hAnsi="Kohinoor Devanagari" w:cs="Kohinoor Devanagari"/>
-          <w:shd w:val="clear" w:color="auto" w:fill="F1F5F9"/>
-        </w:rPr>
-        <w:t>।</w:t>
-      </w:r>
-      <w:r>
-        <w:rPr>
-          <w:rFonts w:eastAsia="Courier New"/>
-          <w:shd w:val="clear" w:color="auto" w:fill="F1F5F9"/>
-        </w:rPr>
-        <w:t xml:space="preserve"> </w:t>
-      </w:r>
-      <w:r>
-        <w:rPr>
-          <w:rFonts w:ascii="Kohinoor Devanagari" w:eastAsia="Courier New" w:hAnsi="Kohinoor Devanagari" w:cs="Kohinoor Devanagari"/>
-          <w:shd w:val="clear" w:color="auto" w:fill="F1F5F9"/>
-        </w:rPr>
-        <w:t>॥</w:t>
-      </w:r>
-      <w:r>
-        <w:t>).</w:t>
-      </w:r>
-    </w:p>
-    <w:p>
-      <w:pPr>
-        <w:spacing w:line="360" w:lineRule="auto"/>
-        <w:ind w:left="20"/>
-      </w:pPr>
-      <w:r>
-        <w:t>5. Whitespace collapsed.</w:t>
-      </w:r>
-    </w:p>
-    <w:p>
-      <w:pPr>
-        <w:spacing w:line="360" w:lineRule="auto"/>
-      </w:pPr>
-      <w:r>
-        <w:t xml:space="preserve"> </w:t>
-      </w:r>
-    </w:p>
-    <w:p>
-      <w:pPr>
-        <w:spacing w:line="360" w:lineRule="auto"/>
-      </w:pPr>
-      <w:r>
-        <w:t xml:space="preserve">The normaliser is </w:t>
-      </w:r>
-      <w:r>
-        <w:rPr>
-          <w:b/>
-          <w:bCs/>
-        </w:rPr>
-        <w:t>deterministic and idempotent</w:t>
-      </w:r>
-      <w:r>
-        <w:t>, guaranteeing reproducible WER across runs. The exact same normaliser is applied to both hypothesis and reference before scoring.</w:t>
-      </w:r>
-    </w:p>
-    <w:p>
-      <w:pPr>
-        <w:spacing w:line="360" w:lineRule="auto"/>
-      </w:pPr>
-      <w:r>
-        <w:t xml:space="preserve"> </w:t>
-      </w:r>
-    </w:p>
-    <w:p>
-      <w:pPr>
-        <w:spacing w:line="360" w:lineRule="auto"/>
-      </w:pPr>
-      <w:r>
-        <w:rPr>
-          <w:b/>
-          <w:bCs/>
-        </w:rPr>
-        <w:t>Path rewriting.</w:t>
-      </w:r>
-      <w:r>
-        <w:t xml:space="preserve"> The upstream manifests ship with absolute paths pointing at the dataset author's server. </w:t>
-      </w:r>
-      <w:proofErr w:type="spellStart"/>
-      <w:r>
-        <w:rPr>
-          <w:rFonts w:eastAsia="Courier New"/>
-          <w:shd w:val="clear" w:color="auto" w:fill="F1F5F9"/>
-        </w:rPr>
-        <w:t>rewrite_manifest_paths</w:t>
-      </w:r>
-      <w:proofErr w:type="spellEnd"/>
-      <w:r>
-        <w:rPr>
-          <w:rFonts w:eastAsia="Courier New"/>
-          <w:shd w:val="clear" w:color="auto" w:fill="F1F5F9"/>
-        </w:rPr>
-        <w:t>(...)</w:t>
-      </w:r>
-      <w:r>
-        <w:t xml:space="preserve"> rebases them to the Kaggle mount and inserts the missing 3-digit speaker sub-directory (</w:t>
-      </w:r>
-      <w:r>
-        <w:rPr>
-          <w:rFonts w:eastAsia="Courier New"/>
-          <w:shd w:val="clear" w:color="auto" w:fill="F1F5F9"/>
-        </w:rPr>
-        <w:t>&lt;split&gt;/&lt;spk3&gt;/&lt;file&gt;.wav</w:t>
-      </w:r>
-      <w:r>
-        <w:t>) which the physical layout requires.</w:t>
-      </w:r>
-    </w:p>
-    <w:p>
-      <w:pPr>
-        <w:spacing w:line="360" w:lineRule="auto"/>
-      </w:pPr>
-      <w:r>
-        <w:t xml:space="preserve"> </w:t>
-      </w:r>
-    </w:p>
-    <w:p>
-      <w:pPr>
-        <w:pBdr>
-          <w:bottom w:val="single" w:sz="6" w:space="1" w:color="auto"/>
-        </w:pBdr>
-        <w:spacing w:line="360" w:lineRule="auto"/>
-      </w:pPr>
-    </w:p>
-    <w:p>
-      <w:pPr>
-        <w:spacing w:line="360" w:lineRule="auto"/>
-      </w:pPr>
-      <w:r>
-        <w:t xml:space="preserve"> </w:t>
-      </w:r>
-    </w:p>
-    <w:p>
-      <w:pPr>
-        <w:pStyle w:val="Heading2"/>
-        <w:spacing w:line="360" w:lineRule="auto"/>
-        <w:rPr>
-          <w:sz w:val="24"/>
-          <w:szCs w:val="24"/>
-        </w:rPr>
-      </w:pPr>
-      <w:r>
-        <w:rPr>
-          <w:sz w:val="24"/>
-          <w:szCs w:val="24"/>
-        </w:rPr>
-        <w:t xml:space="preserve">5. Classical baseline </w:t>
-      </w:r>
-      <w:r>
-        <w:rPr>
-          <w:sz w:val="24"/>
-          <w:szCs w:val="24"/>
-        </w:rPr>
+      </w:pPr>
+      <w:r>
+        <w:rPr>
+          <w:b/>
+          <w:bCs/>
+        </w:rPr>
+        <w:t>Model.</w:t>
+      </w:r>
+      <w:r>
+        <w:t xml:space="preserve"> 16-component diagonal GMM per class (</w:t>
+      </w:r>
+      <w:proofErr w:type="spellStart"/>
+      <w:r>
+        <w:rPr>
+          <w:rFonts w:eastAsia="Courier New"/>
+          <w:shd w:val="clear" w:color="auto" w:fill="F1F5F9"/>
+        </w:rPr>
+        <w:t>sklearn.mixture.GaussianMixture</w:t>
+      </w:r>
+      <w:proofErr w:type="spellEnd"/>
+      <w:r>
+        <w:t>). Inference computes the average log-likelihood of each frame under every GMM; argmax = predicted class.</w:t>
+      </w:r>
+    </w:p>
+    <w:p>
+      <w:pPr>
+        <w:spacing w:line="360" w:lineRule="auto"/>
+      </w:pPr>
+      <w:r>
+        <w:rPr>
+          <w:b/>
+          <w:bCs/>
+        </w:rPr>
+        <w:t>Result</w:t>
+      </w:r>
+      <w:r>
+        <w:t xml:space="preserve"> (from Section 6 of the training notebook): ~60-70 % top-1 accuracy on the held-out 20 % split, with expected confusions between phonetically similar words. The confusion matrix (Figure </w:t>
+      </w:r>
+      <w:r>
         <w:t>-</w:t>
       </w:r>
       <w:r>
-        <w:rPr>
-          <w:sz w:val="24"/>
-          <w:szCs w:val="24"/>
-        </w:rPr>
-        <w:t xml:space="preserve"> GMM keyword spotter (Day 2)</w:t>
-      </w:r>
-    </w:p>
-    <w:p>
-      <w:pPr>
-        <w:spacing w:line="360" w:lineRule="auto"/>
-      </w:pPr>
-      <w:r>
-        <w:lastRenderedPageBreak/>
-        <w:t>I</w:t>
-      </w:r>
-      <w:r>
-        <w:t xml:space="preserve"> buil</w:t>
-      </w:r>
-      <w:r>
-        <w:t>t</w:t>
-      </w:r>
-      <w:r>
-        <w:t xml:space="preserve"> the classical pre-deep-learning baseline as a per-class Gaussian Mixture Model classifier over MFCC frames.</w:t>
-      </w:r>
-    </w:p>
-    <w:p>
-      <w:pPr>
-        <w:spacing w:line="360" w:lineRule="auto"/>
-      </w:pPr>
-      <w:r>
-        <w:t xml:space="preserve"> </w:t>
-      </w:r>
-    </w:p>
-    <w:p>
-      <w:pPr>
-        <w:spacing w:line="360" w:lineRule="auto"/>
-      </w:pPr>
-      <w:r>
-        <w:rPr>
-          <w:b/>
-          <w:bCs/>
-        </w:rPr>
-        <w:t>Features.</w:t>
-      </w:r>
-      <w:r>
-        <w:t xml:space="preserve"> 13 MFCCs + Δ + Δ² = 39-dim, 25 </w:t>
-      </w:r>
-      <w:proofErr w:type="spellStart"/>
-      <w:r>
-        <w:t>ms</w:t>
-      </w:r>
-      <w:proofErr w:type="spellEnd"/>
-      <w:r>
-        <w:t xml:space="preserve"> window / 10 </w:t>
-      </w:r>
-      <w:proofErr w:type="spellStart"/>
-      <w:r>
-        <w:t>ms</w:t>
-      </w:r>
-      <w:proofErr w:type="spellEnd"/>
-      <w:r>
-        <w:t xml:space="preserve"> hop.</w:t>
-      </w:r>
-    </w:p>
-    <w:p>
-      <w:pPr>
-        <w:spacing w:line="360" w:lineRule="auto"/>
-      </w:pPr>
-      <w:r>
-        <w:t xml:space="preserve"> </w:t>
-      </w:r>
-    </w:p>
-    <w:p>
-      <w:pPr>
-        <w:spacing w:line="360" w:lineRule="auto"/>
-      </w:pPr>
-      <w:r>
-        <w:rPr>
-          <w:b/>
-          <w:bCs/>
-        </w:rPr>
-        <w:t>Classes.</w:t>
-      </w:r>
-      <w:r>
-        <w:t xml:space="preserve"> Five English technical keywords (</w:t>
+        <w:t xml:space="preserve"> insert screenshot of Section 6 output) shows that </w:t>
+      </w:r>
+      <w:proofErr w:type="spellStart"/>
+      <w:r>
+        <w:rPr>
+          <w:rFonts w:eastAsia="Courier New"/>
+          <w:shd w:val="clear" w:color="auto" w:fill="F1F5F9"/>
+        </w:rPr>
+        <w:t>linux</w:t>
+      </w:r>
+      <w:proofErr w:type="spellEnd"/>
+      <w:r>
+        <w:t xml:space="preserve"> is most often confused with </w:t>
       </w:r>
       <w:r>
         <w:rPr>
@@ -2268,154 +2373,6 @@
         <w:t>tutorial</w:t>
       </w:r>
       <w:r>
-        <w:t xml:space="preserve">, </w:t>
-      </w:r>
-      <w:proofErr w:type="spellStart"/>
-      <w:r>
-        <w:rPr>
-          <w:rFonts w:eastAsia="Courier New"/>
-          <w:shd w:val="clear" w:color="auto" w:fill="F1F5F9"/>
-        </w:rPr>
-        <w:t>linux</w:t>
-      </w:r>
-      <w:proofErr w:type="spellEnd"/>
-      <w:r>
-        <w:t xml:space="preserve">, </w:t>
-      </w:r>
-      <w:r>
-        <w:rPr>
-          <w:rFonts w:eastAsia="Courier New"/>
-          <w:shd w:val="clear" w:color="auto" w:fill="F1F5F9"/>
-        </w:rPr>
-        <w:t>python</w:t>
-      </w:r>
-      <w:r>
-        <w:t xml:space="preserve">, </w:t>
-      </w:r>
-      <w:r>
-        <w:rPr>
-          <w:rFonts w:eastAsia="Courier New"/>
-          <w:shd w:val="clear" w:color="auto" w:fill="F1F5F9"/>
-        </w:rPr>
-        <w:t>file</w:t>
-      </w:r>
-      <w:r>
-        <w:t xml:space="preserve">, </w:t>
-      </w:r>
-      <w:r>
-        <w:rPr>
-          <w:rFonts w:eastAsia="Courier New"/>
-          <w:shd w:val="clear" w:color="auto" w:fill="F1F5F9"/>
-        </w:rPr>
-        <w:t>window</w:t>
-      </w:r>
-      <w:r>
-        <w:t xml:space="preserve">) plus a </w:t>
-      </w:r>
-      <w:r>
-        <w:rPr>
-          <w:rFonts w:eastAsia="Courier New"/>
-          <w:shd w:val="clear" w:color="auto" w:fill="F1F5F9"/>
-        </w:rPr>
-        <w:t>&lt;background&gt;</w:t>
-      </w:r>
-      <w:r>
-        <w:t xml:space="preserve"> class of utterances containing none of them. Up to 80 utterances per class in </w:t>
-      </w:r>
-      <w:r>
-        <w:rPr>
-          <w:rFonts w:eastAsia="Courier New"/>
-          <w:shd w:val="clear" w:color="auto" w:fill="F1F5F9"/>
-        </w:rPr>
-        <w:t>QUICK_MODE</w:t>
-      </w:r>
-      <w:r>
-        <w:t>.</w:t>
-      </w:r>
-    </w:p>
-    <w:p>
-      <w:pPr>
-        <w:spacing w:line="360" w:lineRule="auto"/>
-      </w:pPr>
-      <w:r>
-        <w:t xml:space="preserve"> </w:t>
-      </w:r>
-    </w:p>
-    <w:p>
-      <w:pPr>
-        <w:spacing w:line="360" w:lineRule="auto"/>
-      </w:pPr>
-      <w:r>
-        <w:rPr>
-          <w:b/>
-          <w:bCs/>
-        </w:rPr>
-        <w:t>Model.</w:t>
-      </w:r>
-      <w:r>
-        <w:t xml:space="preserve"> 16-component diagonal GMM per class (</w:t>
-      </w:r>
-      <w:proofErr w:type="spellStart"/>
-      <w:r>
-        <w:rPr>
-          <w:rFonts w:eastAsia="Courier New"/>
-          <w:shd w:val="clear" w:color="auto" w:fill="F1F5F9"/>
-        </w:rPr>
-        <w:t>sklearn.mixture.GaussianMixture</w:t>
-      </w:r>
-      <w:proofErr w:type="spellEnd"/>
-      <w:r>
-        <w:t>). Inference computes the average log-likelihood of each frame under every GMM; argmax = predicted class.</w:t>
-      </w:r>
-    </w:p>
-    <w:p>
-      <w:pPr>
-        <w:spacing w:line="360" w:lineRule="auto"/>
-      </w:pPr>
-      <w:r>
-        <w:t xml:space="preserve"> </w:t>
-      </w:r>
-    </w:p>
-    <w:p>
-      <w:pPr>
-        <w:spacing w:line="360" w:lineRule="auto"/>
-      </w:pPr>
-      <w:r>
-        <w:rPr>
-          <w:b/>
-          <w:bCs/>
-        </w:rPr>
-        <w:t>Result</w:t>
-      </w:r>
-      <w:r>
-        <w:t xml:space="preserve"> (from Section 6 of the training notebook): ~60-70 % top-1 accuracy on the held-out 20 % split, with expected confusions between phonetically similar words. The confusion matrix (Figure </w:t>
-      </w:r>
-      <w:r>
-        <w:t>-</w:t>
-      </w:r>
-      <w:r>
-        <w:t xml:space="preserve"> insert screenshot of Section 6 output) shows that </w:t>
-      </w:r>
-      <w:proofErr w:type="spellStart"/>
-      <w:r>
-        <w:rPr>
-          <w:rFonts w:eastAsia="Courier New"/>
-          <w:shd w:val="clear" w:color="auto" w:fill="F1F5F9"/>
-        </w:rPr>
-        <w:t>linux</w:t>
-      </w:r>
-      <w:proofErr w:type="spellEnd"/>
-      <w:r>
-        <w:t xml:space="preserve"> is most often confused with </w:t>
-      </w:r>
-      <w:r>
-        <w:rPr>
-          <w:rFonts w:eastAsia="Courier New"/>
-          <w:shd w:val="clear" w:color="auto" w:fill="F1F5F9"/>
-        </w:rPr>
-        <w:t>tutorial</w:t>
-      </w:r>
-      <w:r>
         <w:t xml:space="preserve"> (both share the schwa+/l/ pattern in the second syllable).</w:t>
       </w:r>
     </w:p>
@@ -2424,19 +2381,18 @@
         <w:spacing w:line="360" w:lineRule="auto"/>
       </w:pPr>
       <w:r>
-        <w:t xml:space="preserve"> </w:t>
-      </w:r>
-    </w:p>
-    <w:p>
-      <w:pPr>
-        <w:spacing w:line="360" w:lineRule="auto"/>
-      </w:pPr>
-      <w:r>
-        <w:rPr>
-          <w:b/>
-          <w:bCs/>
-        </w:rPr>
-        <w:t>Why this baseline is not a full ASR.</w:t>
+        <w:rPr>
+          <w:b/>
+          <w:bCs/>
+        </w:rPr>
+        <w:t>Why this baseline is not a full ASR</w:t>
+      </w:r>
+      <w:r>
+        <w:rPr>
+          <w:b/>
+          <w:bCs/>
+        </w:rPr>
+        <w:t>?</w:t>
       </w:r>
       <w:r>
         <w:t xml:space="preserve"> The GMM classifies </w:t>
@@ -2588,7 +2544,6 @@
           <w:b/>
           <w:bCs/>
         </w:rPr>
-        <w:lastRenderedPageBreak/>
         <w:t>Training regime.</w:t>
       </w:r>
       <w:r>
@@ -2645,7 +2600,11 @@
         <w:t>near-empty output</w:t>
       </w:r>
       <w:r>
-        <w:t>: the model collapses to producing 2-3 characters per utterance, dominated by high-frequency Devanagari vowels. This is a well-known failure mode: with 100+ character classes and only 5 hours of training data, the CTC model does not accumulate enough evidence to break out of the blank-token trap.</w:t>
+        <w:t xml:space="preserve">: the model collapses to producing 2-3 characters per utterance, dominated by high-frequency Devanagari vowels. </w:t>
+      </w:r>
+      <w:r>
+        <w:lastRenderedPageBreak/>
+        <w:t>This is a well-known failure mode: with 100+ character classes and only 5 hours of training data, the CTC model does not accumulate enough evidence to break out of the blank-token trap.</w:t>
       </w:r>
     </w:p>
     <w:p>
@@ -3010,11 +2969,7 @@
         <w:t>-</w:t>
       </w:r>
       <w:r>
-        <w:t xml:space="preserve"> it cannot on its own model the bilingual technical vocabulary of MUCS. This motivates the </w:t>
-      </w:r>
-      <w:r>
-        <w:lastRenderedPageBreak/>
-        <w:t>SLAM-ASR architecture, which reuses Whisper's frozen encoder while replacing the decoder with a much stronger LLM.</w:t>
+        <w:t xml:space="preserve"> it cannot on its own model the bilingual technical vocabulary of MUCS. This motivates the SLAM-ASR architecture, which reuses Whisper's frozen encoder while replacing the decoder with a much stronger LLM.</w:t>
       </w:r>
     </w:p>
     <w:p>
@@ -3023,6 +2978,18 @@
       </w:pPr>
       <w:r>
         <w:t xml:space="preserve"> </w:t>
+      </w:r>
+    </w:p>
+    <w:p>
+      <w:pPr>
+        <w:rPr>
+          <w:b/>
+          <w:bCs/>
+          <w:color w:val="000000"/>
+        </w:rPr>
+      </w:pPr>
+      <w:r>
+        <w:br w:type="page"/>
       </w:r>
     </w:p>
     <w:p>
@@ -3040,6 +3007,7 @@
           <w:sz w:val="24"/>
           <w:szCs w:val="24"/>
         </w:rPr>
+        <w:lastRenderedPageBreak/>
         <w:t xml:space="preserve">SLAM-ASR </w:t>
       </w:r>
       <w:r>
@@ -3236,6 +3204,15 @@
       <w:r>
         <w:br/>
       </w:r>
+    </w:p>
+    <w:p>
+      <w:pPr>
+        <w:spacing w:line="360" w:lineRule="auto"/>
+        <w:rPr>
+          <w:b/>
+          <w:bCs/>
+        </w:rPr>
+      </w:pPr>
     </w:p>
     <w:p>
       <w:pPr>
@@ -3458,7 +3435,6 @@
                 <w:b/>
                 <w:bCs/>
               </w:rPr>
-              <w:lastRenderedPageBreak/>
               <w:t>Component</w:t>
             </w:r>
           </w:p>
@@ -3558,6 +3534,7 @@
               <w:spacing w:line="360" w:lineRule="auto"/>
             </w:pPr>
             <w:r>
+              <w:lastRenderedPageBreak/>
               <w:t>Qwen-2.5-1.5B backbone (4-bit NF4, frozen)</w:t>
             </w:r>
           </w:p>
@@ -3801,6 +3778,7 @@
       <w:pPr>
         <w:pStyle w:val="Heading3"/>
         <w:spacing w:line="360" w:lineRule="auto"/>
+        <w:jc w:val="center"/>
         <w:rPr>
           <w:sz w:val="24"/>
           <w:szCs w:val="24"/>
@@ -3812,13 +3790,6 @@
           <w:szCs w:val="24"/>
         </w:rPr>
         <w:t>Training</w:t>
-      </w:r>
-      <w:r>
-        <w:rPr>
-          <w:sz w:val="24"/>
-          <w:szCs w:val="24"/>
-        </w:rPr>
-        <w:t>.</w:t>
       </w:r>
     </w:p>
     <w:p>
@@ -3834,13 +3805,14 @@
         <w:rPr>
           <w:b/>
           <w:bCs/>
-          <w:i/>
-          <w:iCs/>
         </w:rPr>
         <w:t>Data.</w:t>
       </w:r>
       <w:r>
-        <w:t xml:space="preserve"> 3-hour subset of MUCS train (</w:t>
+        <w:t xml:space="preserve"> </w:t>
+      </w:r>
+      <w:r>
+        <w:t>3-hour subset of MUCS train (</w:t>
       </w:r>
       <w:r>
         <w:rPr>
@@ -3876,8 +3848,6 @@
         <w:rPr>
           <w:b/>
           <w:bCs/>
-          <w:i/>
-          <w:iCs/>
         </w:rPr>
         <w:t>Optimiser.</w:t>
       </w:r>
@@ -3924,8 +3894,6 @@
         <w:rPr>
           <w:b/>
           <w:bCs/>
-          <w:i/>
-          <w:iCs/>
         </w:rPr>
         <w:t>Compute.</w:t>
       </w:r>
@@ -3992,8 +3960,6 @@
         <w:rPr>
           <w:b/>
           <w:bCs/>
-          <w:i/>
-          <w:iCs/>
         </w:rPr>
         <w:t>Steps.</w:t>
       </w:r>
@@ -4014,8 +3980,6 @@
         <w:rPr>
           <w:b/>
           <w:bCs/>
-          <w:i/>
-          <w:iCs/>
         </w:rPr>
         <w:t>Training loss curve.</w:t>
       </w:r>
@@ -4279,14 +4243,15 @@
     </w:tbl>
     <w:p>
       <w:pPr>
-        <w:spacing w:before="240" w:line="360" w:lineRule="auto"/>
-      </w:pPr>
-    </w:p>
-    <w:p>
-      <w:pPr>
         <w:spacing w:line="360" w:lineRule="auto"/>
         <w:ind w:firstLine="720"/>
       </w:pPr>
+    </w:p>
+    <w:p>
+      <w:pPr>
+        <w:spacing w:line="360" w:lineRule="auto"/>
+        <w:ind w:firstLine="720"/>
+      </w:pPr>
       <w:r>
         <w:t xml:space="preserve">The loss drops rapidly in the first 50 steps (LLM warm-up) and then plateaus around 6.5 </w:t>
       </w:r>
@@ -4371,11 +4336,7 @@
         <w:t>-&lt;step&gt;/</w:t>
       </w:r>
       <w:r>
-        <w:t>. This let us recover from an HF-Trainer end-</w:t>
-      </w:r>
-      <w:r>
-        <w:lastRenderedPageBreak/>
-        <w:t>of-epoch save crash (</w:t>
+        <w:t>. This let us recover from an HF-Trainer end-of-epoch save crash (</w:t>
       </w:r>
       <w:proofErr w:type="spellStart"/>
       <w:r>
@@ -4455,137 +4416,141 @@
           <w:szCs w:val="24"/>
         </w:rPr>
       </w:pPr>
-    </w:p>
-    <w:p>
-      <w:pPr>
-        <w:pStyle w:val="Heading2"/>
-        <w:spacing w:line="360" w:lineRule="auto"/>
-        <w:jc w:val="center"/>
+      <w:r>
         <w:rPr>
           <w:sz w:val="24"/>
           <w:szCs w:val="24"/>
         </w:rPr>
-      </w:pPr>
-      <w:r>
+        <w:lastRenderedPageBreak/>
+        <w:t>Evaluation</w:t>
+      </w:r>
+    </w:p>
+    <w:p>
+      <w:pPr>
+        <w:spacing w:line="360" w:lineRule="auto"/>
+      </w:pPr>
+      <w:r>
+        <w:rPr>
+          <w:b/>
+          <w:bCs/>
+        </w:rPr>
+        <w:t>Metric.</w:t>
+      </w:r>
+      <w:r>
+        <w:t xml:space="preserve"> Word Error Rate via </w:t>
+      </w:r>
+      <w:proofErr w:type="spellStart"/>
+      <w:r>
+        <w:rPr>
+          <w:rFonts w:eastAsia="Courier New"/>
+          <w:shd w:val="clear" w:color="auto" w:fill="F1F5F9"/>
+        </w:rPr>
+        <w:t>jiwer.wer</w:t>
+      </w:r>
+      <w:proofErr w:type="spellEnd"/>
+      <w:r>
+        <w:rPr>
+          <w:rFonts w:eastAsia="Courier New"/>
+          <w:shd w:val="clear" w:color="auto" w:fill="F1F5F9"/>
+        </w:rPr>
+        <w:t>(...)</w:t>
+      </w:r>
+      <w:r>
+        <w:t xml:space="preserve">, after </w:t>
+      </w:r>
+      <w:proofErr w:type="spellStart"/>
+      <w:r>
+        <w:rPr>
+          <w:rFonts w:eastAsia="Courier New"/>
+          <w:shd w:val="clear" w:color="auto" w:fill="F1F5F9"/>
+        </w:rPr>
+        <w:t>CodeSwitchTextNormalizer</w:t>
+      </w:r>
+      <w:proofErr w:type="spellEnd"/>
+      <w:r>
+        <w:t xml:space="preserve"> is applied to both hypothesis and reference.</w:t>
+      </w:r>
+      <w:r>
+        <w:br/>
+      </w:r>
+      <w:r>
+        <w:rPr>
+          <w:b/>
+          <w:bCs/>
+        </w:rPr>
+        <w:t>Secondary.</w:t>
+      </w:r>
+      <w:r>
+        <w:t xml:space="preserve"> CER, per-language WER (Hindi tokens only, English tokens only, via token-level alignment through </w:t>
+      </w:r>
+      <w:proofErr w:type="spellStart"/>
+      <w:r>
+        <w:rPr>
+          <w:rFonts w:eastAsia="Courier New"/>
+          <w:shd w:val="clear" w:color="auto" w:fill="F1F5F9"/>
+        </w:rPr>
+        <w:t>jiwer.process_words</w:t>
+      </w:r>
+      <w:proofErr w:type="spellEnd"/>
+      <w:r>
+        <w:t>), and OOV rate against the training subset.</w:t>
+      </w:r>
+      <w:r>
+        <w:br/>
+      </w:r>
+      <w:r>
+        <w:rPr>
+          <w:b/>
+          <w:bCs/>
+        </w:rPr>
+        <w:t>Scale.</w:t>
+      </w:r>
+      <w:r>
+        <w:t xml:space="preserve"> 300-utterance samples of test and </w:t>
+      </w:r>
+      <w:proofErr w:type="spellStart"/>
+      <w:r>
+        <w:t>blindtest</w:t>
+      </w:r>
+      <w:proofErr w:type="spellEnd"/>
+      <w:r>
+        <w:t xml:space="preserve"> (subset for compute; full-set decoding is a one-line change in Section 10).</w:t>
+      </w:r>
+    </w:p>
+    <w:p>
+      <w:pPr>
+        <w:spacing w:line="360" w:lineRule="auto"/>
+      </w:pPr>
+    </w:p>
+    <w:p>
+      <w:pPr>
+        <w:pStyle w:val="Heading3"/>
+        <w:spacing w:line="360" w:lineRule="auto"/>
         <w:rPr>
           <w:sz w:val="24"/>
           <w:szCs w:val="24"/>
         </w:rPr>
-        <w:t>Evaluation</w:t>
-      </w:r>
-    </w:p>
-    <w:p>
-      <w:pPr>
-        <w:spacing w:line="360" w:lineRule="auto"/>
-      </w:pPr>
-      <w:r>
-        <w:rPr>
-          <w:b/>
-          <w:bCs/>
-        </w:rPr>
-        <w:t>Metric.</w:t>
-      </w:r>
-      <w:r>
-        <w:t xml:space="preserve"> Word Error Rate via </w:t>
-      </w:r>
-      <w:proofErr w:type="spellStart"/>
-      <w:r>
-        <w:rPr>
-          <w:rFonts w:eastAsia="Courier New"/>
-          <w:shd w:val="clear" w:color="auto" w:fill="F1F5F9"/>
-        </w:rPr>
-        <w:t>jiwer.wer</w:t>
-      </w:r>
-      <w:proofErr w:type="spellEnd"/>
-      <w:r>
-        <w:rPr>
-          <w:rFonts w:eastAsia="Courier New"/>
-          <w:shd w:val="clear" w:color="auto" w:fill="F1F5F9"/>
-        </w:rPr>
-        <w:t>(...)</w:t>
-      </w:r>
-      <w:r>
-        <w:t xml:space="preserve">, after </w:t>
-      </w:r>
-      <w:proofErr w:type="spellStart"/>
-      <w:r>
-        <w:rPr>
-          <w:rFonts w:eastAsia="Courier New"/>
-          <w:shd w:val="clear" w:color="auto" w:fill="F1F5F9"/>
-        </w:rPr>
-        <w:t>CodeSwitchTextNormalizer</w:t>
-      </w:r>
-      <w:proofErr w:type="spellEnd"/>
-      <w:r>
-        <w:t xml:space="preserve"> is applied to both hypothesis and reference.</w:t>
-      </w:r>
-      <w:r>
-        <w:br/>
-      </w:r>
-      <w:r>
-        <w:rPr>
-          <w:b/>
-          <w:bCs/>
-        </w:rPr>
-        <w:t>Secondary.</w:t>
-      </w:r>
-      <w:r>
-        <w:t xml:space="preserve"> CER, per-language WER (Hindi tokens only, English tokens only, via token-level alignment through </w:t>
-      </w:r>
-      <w:proofErr w:type="spellStart"/>
-      <w:r>
-        <w:rPr>
-          <w:rFonts w:eastAsia="Courier New"/>
-          <w:shd w:val="clear" w:color="auto" w:fill="F1F5F9"/>
-        </w:rPr>
-        <w:t>jiwer.process_words</w:t>
-      </w:r>
-      <w:proofErr w:type="spellEnd"/>
-      <w:r>
-        <w:t>), and OOV rate against the training subset.</w:t>
-      </w:r>
-      <w:r>
-        <w:br/>
-      </w:r>
-      <w:r>
-        <w:rPr>
-          <w:b/>
-          <w:bCs/>
-        </w:rPr>
-        <w:t>Scale.</w:t>
-      </w:r>
-      <w:r>
-        <w:t xml:space="preserve"> 300-utterance samples of test and </w:t>
-      </w:r>
-      <w:proofErr w:type="spellStart"/>
-      <w:r>
-        <w:t>blindtest</w:t>
-      </w:r>
-      <w:proofErr w:type="spellEnd"/>
-      <w:r>
-        <w:t xml:space="preserve"> (subset for compute; full-set decoding is a one-line change in Section 10).</w:t>
-      </w:r>
-    </w:p>
-    <w:p>
-      <w:pPr>
-        <w:spacing w:line="360" w:lineRule="auto"/>
-      </w:pPr>
-    </w:p>
-    <w:p>
-      <w:pPr>
-        <w:pStyle w:val="Heading3"/>
-        <w:spacing w:line="360" w:lineRule="auto"/>
+      </w:pPr>
+      <w:r>
         <w:rPr>
           <w:sz w:val="24"/>
           <w:szCs w:val="24"/>
         </w:rPr>
-      </w:pPr>
+        <w:t xml:space="preserve">Main </w:t>
+      </w:r>
       <w:r>
         <w:rPr>
           <w:sz w:val="24"/>
           <w:szCs w:val="24"/>
         </w:rPr>
-        <w:t>Main result</w:t>
+        <w:t>R</w:t>
+      </w:r>
+      <w:r>
+        <w:rPr>
+          <w:sz w:val="24"/>
+          <w:szCs w:val="24"/>
+        </w:rPr>
+        <w:t>esult</w:t>
       </w:r>
     </w:p>
     <w:tbl>
@@ -5239,17 +5204,20 @@
           <w:i/>
           <w:iCs/>
         </w:rPr>
+        <w:t>CTC (WER 0.998).</w:t>
+      </w:r>
+      <w:r>
+        <w:t xml:space="preserve"> Character-level Bi-LSTM trained on 5 h of data collapses to near-empty output </w:t>
+      </w:r>
+      <w:r>
+        <w:t>-</w:t>
+      </w:r>
+      <w:r>
+        <w:t xml:space="preserve"> a few Devanagari vowels per utterance. WER is close to 1 not because 50 % of words are recognised but because deletions dominate (empty hypothesis vs </w:t>
+      </w:r>
+      <w:r>
         <w:lastRenderedPageBreak/>
-        <w:t>CTC (WER 0.998).</w:t>
-      </w:r>
-      <w:r>
-        <w:t xml:space="preserve"> Character-level Bi-LSTM trained on 5 h of data collapses to near-empty output </w:t>
-      </w:r>
-      <w:r>
-        <w:t>-</w:t>
-      </w:r>
-      <w:r>
-        <w:t xml:space="preserve"> a few Devanagari vowels per utterance. WER is close to 1 not because 50 % of words are recognised but because deletions dominate (empty hypothesis vs 10-word reference = WER 1.0). Classical/early-neural approaches at this scale are simply insufficient for the vocabulary.</w:t>
+        <w:t>10-word reference = WER 1.0). Classical/early-neural approaches at this scale are simply insufficient for the vocabulary.</w:t>
       </w:r>
     </w:p>
     <w:p>
@@ -5546,7 +5514,6 @@
           <w:sz w:val="24"/>
           <w:szCs w:val="24"/>
         </w:rPr>
-        <w:lastRenderedPageBreak/>
         <w:t>Ablation opportunities (future work)</w:t>
       </w:r>
       <w:r>
@@ -5582,6 +5549,7 @@
           <w:b/>
           <w:bCs/>
         </w:rPr>
+        <w:lastRenderedPageBreak/>
         <w:t>Projector warm-up on paired text.</w:t>
       </w:r>
       <w:r>
@@ -6032,7 +6000,6 @@
         <w:spacing w:line="360" w:lineRule="auto"/>
       </w:pPr>
       <w:r>
-        <w:lastRenderedPageBreak/>
         <w:t xml:space="preserve"> </w:t>
       </w:r>
     </w:p>
@@ -10142,6 +10109,119 @@
     </w:lvl>
   </w:abstractNum>
   <w:abstractNum w:abstractNumId="11" w15:restartNumberingAfterBreak="0">
+    <w:nsid w:val="4E2A664D"/>
+    <w:multiLevelType w:val="hybridMultilevel"/>
+    <w:tmpl w:val="CBB21E8C"/>
+    <w:lvl w:ilvl="0" w:tplc="04090001">
+      <w:start w:val="1"/>
+      <w:numFmt w:val="bullet"/>
+      <w:lvlText w:val=""/>
+      <w:lvlJc w:val="left"/>
+      <w:pPr>
+        <w:ind w:left="740" w:hanging="360"/>
+      </w:pPr>
+      <w:rPr>
+        <w:rFonts w:ascii="Symbol" w:hAnsi="Symbol" w:hint="default"/>
+      </w:rPr>
+    </w:lvl>
+    <w:lvl w:ilvl="1" w:tplc="04090003" w:tentative="1">
+      <w:start w:val="1"/>
+      <w:numFmt w:val="bullet"/>
+      <w:lvlText w:val="o"/>
+      <w:lvlJc w:val="left"/>
+      <w:pPr>
+        <w:ind w:left="1460" w:hanging="360"/>
+      </w:pPr>
+      <w:rPr>
+        <w:rFonts w:ascii="Courier New" w:hAnsi="Courier New" w:cs="Courier New" w:hint="default"/>
+      </w:rPr>
+    </w:lvl>
+    <w:lvl w:ilvl="2" w:tplc="04090005" w:tentative="1">
+      <w:start w:val="1"/>
+      <w:numFmt w:val="bullet"/>
+      <w:lvlText w:val=""/>
+      <w:lvlJc w:val="left"/>
+      <w:pPr>
+        <w:ind w:left="2180" w:hanging="360"/>
+      </w:pPr>
+      <w:rPr>
+        <w:rFonts w:ascii="Wingdings" w:hAnsi="Wingdings" w:hint="default"/>
+      </w:rPr>
+    </w:lvl>
+    <w:lvl w:ilvl="3" w:tplc="04090001" w:tentative="1">
+      <w:start w:val="1"/>
+      <w:numFmt w:val="bullet"/>
+      <w:lvlText w:val=""/>
+      <w:lvlJc w:val="left"/>
+      <w:pPr>
+        <w:ind w:left="2900" w:hanging="360"/>
+      </w:pPr>
+      <w:rPr>
+        <w:rFonts w:ascii="Symbol" w:hAnsi="Symbol" w:hint="default"/>
+      </w:rPr>
+    </w:lvl>
+    <w:lvl w:ilvl="4" w:tplc="04090003" w:tentative="1">
+      <w:start w:val="1"/>
+      <w:numFmt w:val="bullet"/>
+      <w:lvlText w:val="o"/>
+      <w:lvlJc w:val="left"/>
+      <w:pPr>
+        <w:ind w:left="3620" w:hanging="360"/>
+      </w:pPr>
+      <w:rPr>
+        <w:rFonts w:ascii="Courier New" w:hAnsi="Courier New" w:cs="Courier New" w:hint="default"/>
+      </w:rPr>
+    </w:lvl>
+    <w:lvl w:ilvl="5" w:tplc="04090005" w:tentative="1">
+      <w:start w:val="1"/>
+      <w:numFmt w:val="bullet"/>
+      <w:lvlText w:val=""/>
+      <w:lvlJc w:val="left"/>
+      <w:pPr>
+        <w:ind w:left="4340" w:hanging="360"/>
+      </w:pPr>
+      <w:rPr>
+        <w:rFonts w:ascii="Wingdings" w:hAnsi="Wingdings" w:hint="default"/>
+      </w:rPr>
+    </w:lvl>
+    <w:lvl w:ilvl="6" w:tplc="04090001" w:tentative="1">
+      <w:start w:val="1"/>
+      <w:numFmt w:val="bullet"/>
+      <w:lvlText w:val=""/>
+      <w:lvlJc w:val="left"/>
+      <w:pPr>
+        <w:ind w:left="5060" w:hanging="360"/>
+      </w:pPr>
+      <w:rPr>
+        <w:rFonts w:ascii="Symbol" w:hAnsi="Symbol" w:hint="default"/>
+      </w:rPr>
+    </w:lvl>
+    <w:lvl w:ilvl="7" w:tplc="04090003" w:tentative="1">
+      <w:start w:val="1"/>
+      <w:numFmt w:val="bullet"/>
+      <w:lvlText w:val="o"/>
+      <w:lvlJc w:val="left"/>
+      <w:pPr>
+        <w:ind w:left="5780" w:hanging="360"/>
+      </w:pPr>
+      <w:rPr>
+        <w:rFonts w:ascii="Courier New" w:hAnsi="Courier New" w:cs="Courier New" w:hint="default"/>
+      </w:rPr>
+    </w:lvl>
+    <w:lvl w:ilvl="8" w:tplc="04090005" w:tentative="1">
+      <w:start w:val="1"/>
+      <w:numFmt w:val="bullet"/>
+      <w:lvlText w:val=""/>
+      <w:lvlJc w:val="left"/>
+      <w:pPr>
+        <w:ind w:left="6500" w:hanging="360"/>
+      </w:pPr>
+      <w:rPr>
+        <w:rFonts w:ascii="Wingdings" w:hAnsi="Wingdings" w:hint="default"/>
+      </w:rPr>
+    </w:lvl>
+  </w:abstractNum>
+  <w:abstractNum w:abstractNumId="12" w15:restartNumberingAfterBreak="0">
     <w:nsid w:val="4E705576"/>
     <w:multiLevelType w:val="hybridMultilevel"/>
     <w:tmpl w:val="C3926B3A"/>
@@ -10254,7 +10334,7 @@
       </w:rPr>
     </w:lvl>
   </w:abstractNum>
-  <w:abstractNum w:abstractNumId="12" w15:restartNumberingAfterBreak="0">
+  <w:abstractNum w:abstractNumId="13" w15:restartNumberingAfterBreak="0">
     <w:nsid w:val="4FB21A06"/>
     <w:multiLevelType w:val="hybridMultilevel"/>
     <w:tmpl w:val="0B762192"/>
@@ -10367,7 +10447,7 @@
       </w:rPr>
     </w:lvl>
   </w:abstractNum>
-  <w:abstractNum w:abstractNumId="13" w15:restartNumberingAfterBreak="0">
+  <w:abstractNum w:abstractNumId="14" w15:restartNumberingAfterBreak="0">
     <w:nsid w:val="5D967EAD"/>
     <w:multiLevelType w:val="hybridMultilevel"/>
     <w:tmpl w:val="2C82EC3A"/>
@@ -10480,7 +10560,7 @@
       </w:rPr>
     </w:lvl>
   </w:abstractNum>
-  <w:abstractNum w:abstractNumId="14" w15:restartNumberingAfterBreak="0">
+  <w:abstractNum w:abstractNumId="15" w15:restartNumberingAfterBreak="0">
     <w:nsid w:val="668B2E9B"/>
     <w:multiLevelType w:val="hybridMultilevel"/>
     <w:tmpl w:val="4E8493EA"/>
@@ -10593,7 +10673,7 @@
       </w:rPr>
     </w:lvl>
   </w:abstractNum>
-  <w:abstractNum w:abstractNumId="15" w15:restartNumberingAfterBreak="0">
+  <w:abstractNum w:abstractNumId="16" w15:restartNumberingAfterBreak="0">
     <w:nsid w:val="669372BB"/>
     <w:multiLevelType w:val="hybridMultilevel"/>
     <w:tmpl w:val="821E599A"/>
@@ -10682,7 +10762,7 @@
       </w:pPr>
     </w:lvl>
   </w:abstractNum>
-  <w:abstractNum w:abstractNumId="16" w15:restartNumberingAfterBreak="0">
+  <w:abstractNum w:abstractNumId="17" w15:restartNumberingAfterBreak="0">
     <w:nsid w:val="6F0616C2"/>
     <w:multiLevelType w:val="hybridMultilevel"/>
     <w:tmpl w:val="AA52937E"/>
@@ -10795,7 +10875,7 @@
       </w:rPr>
     </w:lvl>
   </w:abstractNum>
-  <w:abstractNum w:abstractNumId="17" w15:restartNumberingAfterBreak="0">
+  <w:abstractNum w:abstractNumId="18" w15:restartNumberingAfterBreak="0">
     <w:nsid w:val="71592D77"/>
     <w:multiLevelType w:val="hybridMultilevel"/>
     <w:tmpl w:val="BCF21B64"/>
@@ -10924,16 +11004,16 @@
     <w:abstractNumId w:val="4"/>
   </w:num>
   <w:num w:numId="4" w16cid:durableId="1073309391">
-    <w:abstractNumId w:val="12"/>
+    <w:abstractNumId w:val="13"/>
   </w:num>
   <w:num w:numId="5" w16cid:durableId="1786775184">
-    <w:abstractNumId w:val="17"/>
+    <w:abstractNumId w:val="18"/>
   </w:num>
   <w:num w:numId="6" w16cid:durableId="1714386692">
     <w:abstractNumId w:val="3"/>
   </w:num>
   <w:num w:numId="7" w16cid:durableId="1829402881">
-    <w:abstractNumId w:val="13"/>
+    <w:abstractNumId w:val="14"/>
   </w:num>
   <w:num w:numId="8" w16cid:durableId="1809392375">
     <w:abstractNumId w:val="2"/>
@@ -10945,7 +11025,7 @@
     <w:abstractNumId w:val="10"/>
   </w:num>
   <w:num w:numId="11" w16cid:durableId="1375041756">
-    <w:abstractNumId w:val="14"/>
+    <w:abstractNumId w:val="15"/>
   </w:num>
   <w:num w:numId="12" w16cid:durableId="1815877197">
     <w:abstractNumId w:val="7"/>
@@ -10954,19 +11034,22 @@
     <w:abstractNumId w:val="9"/>
   </w:num>
   <w:num w:numId="14" w16cid:durableId="2074156190">
-    <w:abstractNumId w:val="15"/>
+    <w:abstractNumId w:val="16"/>
   </w:num>
   <w:num w:numId="15" w16cid:durableId="847864197">
-    <w:abstractNumId w:val="16"/>
+    <w:abstractNumId w:val="17"/>
   </w:num>
   <w:num w:numId="16" w16cid:durableId="1770275787">
     <w:abstractNumId w:val="0"/>
   </w:num>
   <w:num w:numId="17" w16cid:durableId="1366712404">
-    <w:abstractNumId w:val="11"/>
+    <w:abstractNumId w:val="12"/>
   </w:num>
   <w:num w:numId="18" w16cid:durableId="1111705738">
     <w:abstractNumId w:val="1"/>
+  </w:num>
+  <w:num w:numId="19" w16cid:durableId="1073158153">
+    <w:abstractNumId w:val="11"/>
   </w:num>
 </w:numbering>
 </file>

</xml_diff>

<commit_message>
Uploaded the updated report with hyperlinks as applicable
</commit_message>
<xml_diff>
--- a/docs/Ravi Teja Kothuru_SLAM ASR_Report.docx
+++ b/docs/Ravi Teja Kothuru_SLAM ASR_Report.docx
@@ -891,13 +891,14 @@
       <w:r>
         <w:t xml:space="preserve">. See </w:t>
       </w:r>
-      <w:r>
-        <w:rPr>
-          <w:color w:val="0563C1"/>
-          <w:u w:val="single"/>
-        </w:rPr>
-        <w:t>`KAGGLE_SETUP.md`</w:t>
-      </w:r>
+      <w:hyperlink r:id="rId5" w:history="1">
+        <w:r>
+          <w:rPr>
+            <w:rStyle w:val="Hyperlink"/>
+          </w:rPr>
+          <w:t>KAGGLE_SETUP.md</w:t>
+        </w:r>
+      </w:hyperlink>
       <w:r>
         <w:t xml:space="preserve"> for step-by-step instructions.</w:t>
       </w:r>
@@ -2174,6 +2175,13 @@
     <w:p>
       <w:pPr>
         <w:spacing w:line="360" w:lineRule="auto"/>
+        <w:ind w:firstLine="720"/>
+      </w:pPr>
+    </w:p>
+    <w:p>
+      <w:pPr>
+        <w:spacing w:line="360" w:lineRule="auto"/>
+        <w:ind w:firstLine="720"/>
       </w:pPr>
       <w:r>
         <w:t>I</w:t>
@@ -2590,6 +2598,7 @@
         <w:ind w:firstLine="720"/>
       </w:pPr>
       <w:r>
+        <w:lastRenderedPageBreak/>
         <w:t xml:space="preserve">Analysing the hypotheses reveals </w:t>
       </w:r>
       <w:r>
@@ -2600,11 +2609,7 @@
         <w:t>near-empty output</w:t>
       </w:r>
       <w:r>
-        <w:t xml:space="preserve">: the model collapses to producing 2-3 characters per utterance, dominated by high-frequency Devanagari vowels. </w:t>
-      </w:r>
-      <w:r>
-        <w:lastRenderedPageBreak/>
-        <w:t>This is a well-known failure mode: with 100+ character classes and only 5 hours of training data, the CTC model does not accumulate enough evidence to break out of the blank-token trap.</w:t>
+        <w:t>: the model collapses to producing 2-3 characters per utterance, dominated by high-frequency Devanagari vowels. This is a well-known failure mode: with 100+ character classes and only 5 hours of training data, the CTC model does not accumulate enough evidence to break out of the blank-token trap.</w:t>
       </w:r>
     </w:p>
     <w:p>
@@ -2982,47 +2987,48 @@
     </w:p>
     <w:p>
       <w:pPr>
-        <w:rPr>
-          <w:b/>
-          <w:bCs/>
-          <w:color w:val="000000"/>
-        </w:rPr>
-      </w:pPr>
-      <w:r>
-        <w:br w:type="page"/>
-      </w:r>
-    </w:p>
-    <w:p>
-      <w:pPr>
-        <w:pStyle w:val="Heading2"/>
         <w:spacing w:line="360" w:lineRule="auto"/>
         <w:jc w:val="center"/>
         <w:rPr>
-          <w:sz w:val="24"/>
-          <w:szCs w:val="24"/>
-        </w:rPr>
-      </w:pPr>
-      <w:r>
-        <w:rPr>
-          <w:sz w:val="24"/>
-          <w:szCs w:val="24"/>
+          <w:b/>
+          <w:bCs/>
+        </w:rPr>
+      </w:pPr>
+      <w:r>
+        <w:rPr>
+          <w:b/>
+          <w:bCs/>
         </w:rPr>
         <w:lastRenderedPageBreak/>
         <w:t xml:space="preserve">SLAM-ASR </w:t>
       </w:r>
       <w:r>
         <w:rPr>
-          <w:sz w:val="24"/>
-          <w:szCs w:val="24"/>
+          <w:b/>
+          <w:bCs/>
         </w:rPr>
         <w:t>-</w:t>
       </w:r>
       <w:r>
         <w:rPr>
-          <w:sz w:val="24"/>
-          <w:szCs w:val="24"/>
-        </w:rPr>
-        <w:t xml:space="preserve"> architecture</w:t>
+          <w:b/>
+          <w:bCs/>
+        </w:rPr>
+        <w:t xml:space="preserve"> </w:t>
+      </w:r>
+      <w:r>
+        <w:rPr>
+          <w:b/>
+          <w:bCs/>
+        </w:rPr>
+        <w:t>A</w:t>
+      </w:r>
+      <w:r>
+        <w:rPr>
+          <w:b/>
+          <w:bCs/>
+        </w:rPr>
+        <w:t>rchitecture</w:t>
       </w:r>
     </w:p>
     <w:p>
@@ -6209,7 +6215,7 @@
       <w:r>
         <w:t xml:space="preserve"> </w:t>
       </w:r>
-      <w:hyperlink r:id="rId5" w:history="1">
+      <w:hyperlink r:id="rId6" w:history="1">
         <w:r>
           <w:rPr>
             <w:rStyle w:val="Hyperlink"/>

</xml_diff>